<commit_message>
Update career goal essay wording
</commit_message>
<xml_diff>
--- a/documents/chaerin-lee-career-goal.docx
+++ b/documents/chaerin-lee-career-goal.docx
@@ -1705,642 +1705,7 @@
         </w:rPr>
       </w:pPr>
       <w:r>
-        <w:rPr>
-          <w:rFonts w:ascii="Trebuchet MS" w:hAnsi="Trebuchet MS"/>
-          <w:lang w:val="es-ES"/>
-        </w:rPr>
-        <w:t xml:space="preserve">As </w:t>
-      </w:r>
-      <w:proofErr w:type="spellStart"/>
-      <w:r>
-        <w:rPr>
-          <w:rFonts w:ascii="Trebuchet MS" w:hAnsi="Trebuchet MS"/>
-          <w:lang w:val="es-ES"/>
-        </w:rPr>
-        <w:t>such</w:t>
-      </w:r>
-      <w:proofErr w:type="spellEnd"/>
-      <w:r>
-        <w:rPr>
-          <w:rFonts w:ascii="Trebuchet MS" w:hAnsi="Trebuchet MS"/>
-          <w:lang w:val="es-ES"/>
-        </w:rPr>
-        <w:t xml:space="preserve">, I </w:t>
-      </w:r>
-      <w:proofErr w:type="spellStart"/>
-      <w:r>
-        <w:rPr>
-          <w:rFonts w:ascii="Trebuchet MS" w:hAnsi="Trebuchet MS"/>
-          <w:lang w:val="es-ES"/>
-        </w:rPr>
-        <w:t>need</w:t>
-      </w:r>
-      <w:proofErr w:type="spellEnd"/>
-      <w:r>
-        <w:rPr>
-          <w:rFonts w:ascii="Trebuchet MS" w:hAnsi="Trebuchet MS"/>
-          <w:lang w:val="es-ES"/>
-        </w:rPr>
-        <w:t xml:space="preserve"> you </w:t>
-      </w:r>
-      <w:proofErr w:type="spellStart"/>
-      <w:r>
-        <w:rPr>
-          <w:rFonts w:ascii="Trebuchet MS" w:hAnsi="Trebuchet MS"/>
-          <w:lang w:val="es-ES"/>
-        </w:rPr>
-        <w:t>because</w:t>
-      </w:r>
-      <w:proofErr w:type="spellEnd"/>
-      <w:r>
-        <w:rPr>
-          <w:rFonts w:ascii="Trebuchet MS" w:hAnsi="Trebuchet MS"/>
-          <w:lang w:val="es-ES"/>
-        </w:rPr>
-        <w:t xml:space="preserve"> I plan </w:t>
-      </w:r>
-      <w:proofErr w:type="spellStart"/>
-      <w:r>
-        <w:rPr>
-          <w:rFonts w:ascii="Trebuchet MS" w:hAnsi="Trebuchet MS"/>
-          <w:lang w:val="es-ES"/>
-        </w:rPr>
-        <w:t>to</w:t>
-      </w:r>
-      <w:proofErr w:type="spellEnd"/>
-      <w:r>
-        <w:rPr>
-          <w:rFonts w:ascii="Trebuchet MS" w:hAnsi="Trebuchet MS"/>
-          <w:lang w:val="es-ES"/>
-        </w:rPr>
-        <w:t xml:space="preserve"> </w:t>
-      </w:r>
-      <w:proofErr w:type="spellStart"/>
-      <w:r>
-        <w:rPr>
-          <w:rFonts w:ascii="Trebuchet MS" w:hAnsi="Trebuchet MS"/>
-          <w:lang w:val="es-ES"/>
-        </w:rPr>
-        <w:t>join</w:t>
-      </w:r>
-      <w:proofErr w:type="spellEnd"/>
-      <w:r>
-        <w:rPr>
-          <w:rFonts w:ascii="Trebuchet MS" w:hAnsi="Trebuchet MS"/>
-          <w:lang w:val="es-ES"/>
-        </w:rPr>
-        <w:t xml:space="preserve"> a </w:t>
-      </w:r>
-      <w:proofErr w:type="spellStart"/>
-      <w:r>
-        <w:rPr>
-          <w:rFonts w:ascii="Trebuchet MS" w:hAnsi="Trebuchet MS"/>
-          <w:lang w:val="es-ES"/>
-        </w:rPr>
-        <w:t>consulting</w:t>
-      </w:r>
-      <w:proofErr w:type="spellEnd"/>
-      <w:r>
-        <w:rPr>
-          <w:rFonts w:ascii="Trebuchet MS" w:hAnsi="Trebuchet MS"/>
-          <w:lang w:val="es-ES"/>
-        </w:rPr>
-        <w:t xml:space="preserve"> </w:t>
-      </w:r>
-      <w:proofErr w:type="spellStart"/>
-      <w:r>
-        <w:rPr>
-          <w:rFonts w:ascii="Trebuchet MS" w:hAnsi="Trebuchet MS"/>
-          <w:lang w:val="es-ES"/>
-        </w:rPr>
-        <w:t>firm</w:t>
-      </w:r>
-      <w:proofErr w:type="spellEnd"/>
-      <w:r>
-        <w:rPr>
-          <w:rFonts w:ascii="Trebuchet MS" w:hAnsi="Trebuchet MS"/>
-          <w:lang w:val="es-ES"/>
-        </w:rPr>
-        <w:t xml:space="preserve"> </w:t>
-      </w:r>
-      <w:proofErr w:type="spellStart"/>
-      <w:r>
-        <w:rPr>
-          <w:rFonts w:ascii="Trebuchet MS" w:hAnsi="Trebuchet MS"/>
-          <w:lang w:val="es-ES"/>
-        </w:rPr>
-        <w:t>afterward</w:t>
-      </w:r>
-      <w:proofErr w:type="spellEnd"/>
-      <w:r>
-        <w:rPr>
-          <w:rFonts w:ascii="Trebuchet MS" w:hAnsi="Trebuchet MS"/>
-          <w:lang w:val="es-ES"/>
-        </w:rPr>
-        <w:t xml:space="preserve"> </w:t>
-      </w:r>
-      <w:proofErr w:type="spellStart"/>
-      <w:r>
-        <w:rPr>
-          <w:rFonts w:ascii="Trebuchet MS" w:hAnsi="Trebuchet MS"/>
-          <w:lang w:val="es-ES"/>
-        </w:rPr>
-        <w:t>to</w:t>
-      </w:r>
-      <w:proofErr w:type="spellEnd"/>
-      <w:r>
-        <w:rPr>
-          <w:rFonts w:ascii="Trebuchet MS" w:hAnsi="Trebuchet MS"/>
-          <w:lang w:val="es-ES"/>
-        </w:rPr>
-        <w:t xml:space="preserve"> </w:t>
-      </w:r>
-      <w:proofErr w:type="spellStart"/>
-      <w:r>
-        <w:rPr>
-          <w:rFonts w:ascii="Trebuchet MS" w:hAnsi="Trebuchet MS"/>
-          <w:lang w:val="es-ES"/>
-        </w:rPr>
-        <w:t>help</w:t>
-      </w:r>
-      <w:proofErr w:type="spellEnd"/>
-      <w:r>
-        <w:rPr>
-          <w:rFonts w:ascii="Trebuchet MS" w:hAnsi="Trebuchet MS"/>
-          <w:lang w:val="es-ES"/>
-        </w:rPr>
-        <w:t xml:space="preserve"> </w:t>
-      </w:r>
-      <w:proofErr w:type="spellStart"/>
-      <w:r>
-        <w:rPr>
-          <w:rFonts w:ascii="Trebuchet MS" w:hAnsi="Trebuchet MS"/>
-          <w:lang w:val="es-ES"/>
-        </w:rPr>
-        <w:t>existing</w:t>
-      </w:r>
-      <w:proofErr w:type="spellEnd"/>
-      <w:r>
-        <w:rPr>
-          <w:rFonts w:ascii="Trebuchet MS" w:hAnsi="Trebuchet MS"/>
-          <w:lang w:val="es-ES"/>
-        </w:rPr>
-        <w:t xml:space="preserve"> </w:t>
-      </w:r>
-      <w:proofErr w:type="spellStart"/>
-      <w:r>
-        <w:rPr>
-          <w:rFonts w:ascii="Trebuchet MS" w:hAnsi="Trebuchet MS"/>
-          <w:lang w:val="es-ES"/>
-        </w:rPr>
-        <w:t>companies</w:t>
-      </w:r>
-      <w:proofErr w:type="spellEnd"/>
-      <w:r>
-        <w:rPr>
-          <w:rFonts w:ascii="Trebuchet MS" w:hAnsi="Trebuchet MS"/>
-          <w:lang w:val="es-ES"/>
-        </w:rPr>
-        <w:t xml:space="preserve"> </w:t>
-      </w:r>
-      <w:proofErr w:type="spellStart"/>
-      <w:r>
-        <w:rPr>
-          <w:rFonts w:ascii="Trebuchet MS" w:hAnsi="Trebuchet MS"/>
-          <w:lang w:val="es-ES"/>
-        </w:rPr>
-        <w:t>better</w:t>
-      </w:r>
-      <w:proofErr w:type="spellEnd"/>
-      <w:r>
-        <w:rPr>
-          <w:rFonts w:ascii="Trebuchet MS" w:hAnsi="Trebuchet MS"/>
-          <w:lang w:val="es-ES"/>
-        </w:rPr>
-        <w:t xml:space="preserve"> </w:t>
-      </w:r>
-      <w:proofErr w:type="spellStart"/>
-      <w:r>
-        <w:rPr>
-          <w:rFonts w:ascii="Trebuchet MS" w:hAnsi="Trebuchet MS"/>
-          <w:lang w:val="es-ES"/>
-        </w:rPr>
-        <w:t>understand</w:t>
-      </w:r>
-      <w:proofErr w:type="spellEnd"/>
-      <w:r>
-        <w:rPr>
-          <w:rFonts w:ascii="Trebuchet MS" w:hAnsi="Trebuchet MS"/>
-          <w:lang w:val="es-ES"/>
-        </w:rPr>
-        <w:t xml:space="preserve"> </w:t>
-      </w:r>
-      <w:proofErr w:type="spellStart"/>
-      <w:r>
-        <w:rPr>
-          <w:rFonts w:ascii="Trebuchet MS" w:hAnsi="Trebuchet MS"/>
-          <w:lang w:val="es-ES"/>
-        </w:rPr>
-        <w:t>their</w:t>
-      </w:r>
-      <w:proofErr w:type="spellEnd"/>
-      <w:r>
-        <w:rPr>
-          <w:rFonts w:ascii="Trebuchet MS" w:hAnsi="Trebuchet MS"/>
-          <w:lang w:val="es-ES"/>
-        </w:rPr>
-        <w:t xml:space="preserve"> </w:t>
-      </w:r>
-      <w:proofErr w:type="spellStart"/>
-      <w:r>
-        <w:rPr>
-          <w:rFonts w:ascii="Trebuchet MS" w:hAnsi="Trebuchet MS"/>
-          <w:lang w:val="es-ES"/>
-        </w:rPr>
-        <w:t>customers</w:t>
-      </w:r>
-      <w:proofErr w:type="spellEnd"/>
-      <w:r>
-        <w:rPr>
-          <w:rFonts w:ascii="Trebuchet MS" w:hAnsi="Trebuchet MS"/>
-          <w:lang w:val="es-ES"/>
-        </w:rPr>
-        <w:t xml:space="preserve"> and </w:t>
-      </w:r>
-      <w:proofErr w:type="spellStart"/>
-      <w:r>
-        <w:rPr>
-          <w:rFonts w:ascii="Trebuchet MS" w:hAnsi="Trebuchet MS"/>
-          <w:lang w:val="es-ES"/>
-        </w:rPr>
-        <w:t>provide</w:t>
-      </w:r>
-      <w:proofErr w:type="spellEnd"/>
-      <w:r>
-        <w:rPr>
-          <w:rFonts w:ascii="Trebuchet MS" w:hAnsi="Trebuchet MS"/>
-          <w:lang w:val="es-ES"/>
-        </w:rPr>
-        <w:t xml:space="preserve"> </w:t>
-      </w:r>
-      <w:proofErr w:type="spellStart"/>
-      <w:r>
-        <w:rPr>
-          <w:rFonts w:ascii="Trebuchet MS" w:hAnsi="Trebuchet MS"/>
-          <w:lang w:val="es-ES"/>
-        </w:rPr>
-        <w:t>better</w:t>
-      </w:r>
-      <w:proofErr w:type="spellEnd"/>
-      <w:r>
-        <w:rPr>
-          <w:rFonts w:ascii="Trebuchet MS" w:hAnsi="Trebuchet MS"/>
-          <w:lang w:val="es-ES"/>
-        </w:rPr>
-        <w:t xml:space="preserve"> </w:t>
-      </w:r>
-      <w:proofErr w:type="spellStart"/>
-      <w:r>
-        <w:rPr>
-          <w:rFonts w:ascii="Trebuchet MS" w:hAnsi="Trebuchet MS"/>
-          <w:lang w:val="es-ES"/>
-        </w:rPr>
-        <w:t>services</w:t>
-      </w:r>
-      <w:proofErr w:type="spellEnd"/>
-      <w:r>
-        <w:rPr>
-          <w:rFonts w:ascii="Trebuchet MS" w:hAnsi="Trebuchet MS"/>
-          <w:lang w:val="es-ES"/>
-        </w:rPr>
-        <w:t xml:space="preserve">. Later, </w:t>
-      </w:r>
-      <w:proofErr w:type="spellStart"/>
-      <w:r>
-        <w:rPr>
-          <w:rFonts w:ascii="Trebuchet MS" w:hAnsi="Trebuchet MS"/>
-          <w:lang w:val="es-ES"/>
-        </w:rPr>
-        <w:t>if</w:t>
-      </w:r>
-      <w:proofErr w:type="spellEnd"/>
-      <w:r>
-        <w:rPr>
-          <w:rFonts w:ascii="Trebuchet MS" w:hAnsi="Trebuchet MS"/>
-          <w:lang w:val="es-ES"/>
-        </w:rPr>
-        <w:t xml:space="preserve"> I </w:t>
-      </w:r>
-      <w:proofErr w:type="spellStart"/>
-      <w:r>
-        <w:rPr>
-          <w:rFonts w:ascii="Trebuchet MS" w:hAnsi="Trebuchet MS"/>
-          <w:lang w:val="es-ES"/>
-        </w:rPr>
-        <w:t>may</w:t>
-      </w:r>
-      <w:proofErr w:type="spellEnd"/>
-      <w:r>
-        <w:rPr>
-          <w:rFonts w:ascii="Trebuchet MS" w:hAnsi="Trebuchet MS"/>
-          <w:lang w:val="es-ES"/>
-        </w:rPr>
-        <w:t xml:space="preserve">, I hope </w:t>
-      </w:r>
-      <w:proofErr w:type="spellStart"/>
-      <w:r>
-        <w:rPr>
-          <w:rFonts w:ascii="Trebuchet MS" w:hAnsi="Trebuchet MS"/>
-          <w:lang w:val="es-ES"/>
-        </w:rPr>
-        <w:t>to</w:t>
-      </w:r>
-      <w:proofErr w:type="spellEnd"/>
-      <w:r>
-        <w:rPr>
-          <w:rFonts w:ascii="Trebuchet MS" w:hAnsi="Trebuchet MS"/>
-          <w:lang w:val="es-ES"/>
-        </w:rPr>
-        <w:t xml:space="preserve"> </w:t>
-      </w:r>
-      <w:proofErr w:type="spellStart"/>
-      <w:r>
-        <w:rPr>
-          <w:rFonts w:ascii="Trebuchet MS" w:hAnsi="Trebuchet MS"/>
-          <w:lang w:val="es-ES"/>
-        </w:rPr>
-        <w:t>start</w:t>
-      </w:r>
-      <w:proofErr w:type="spellEnd"/>
-      <w:r>
-        <w:rPr>
-          <w:rFonts w:ascii="Trebuchet MS" w:hAnsi="Trebuchet MS"/>
-          <w:lang w:val="es-ES"/>
-        </w:rPr>
-        <w:t xml:space="preserve"> </w:t>
-      </w:r>
-      <w:proofErr w:type="spellStart"/>
-      <w:r>
-        <w:rPr>
-          <w:rFonts w:ascii="Trebuchet MS" w:hAnsi="Trebuchet MS"/>
-          <w:lang w:val="es-ES"/>
-        </w:rPr>
-        <w:t>my</w:t>
-      </w:r>
-      <w:proofErr w:type="spellEnd"/>
-      <w:r>
-        <w:rPr>
-          <w:rFonts w:ascii="Trebuchet MS" w:hAnsi="Trebuchet MS"/>
-          <w:lang w:val="es-ES"/>
-        </w:rPr>
-        <w:t xml:space="preserve"> </w:t>
-      </w:r>
-      <w:proofErr w:type="spellStart"/>
-      <w:r>
-        <w:rPr>
-          <w:rFonts w:ascii="Trebuchet MS" w:hAnsi="Trebuchet MS"/>
-          <w:lang w:val="es-ES"/>
-        </w:rPr>
-        <w:t>own</w:t>
-      </w:r>
-      <w:proofErr w:type="spellEnd"/>
-      <w:r>
-        <w:rPr>
-          <w:rFonts w:ascii="Trebuchet MS" w:hAnsi="Trebuchet MS"/>
-          <w:lang w:val="es-ES"/>
-        </w:rPr>
-        <w:t xml:space="preserve"> </w:t>
-      </w:r>
-      <w:proofErr w:type="spellStart"/>
-      <w:r>
-        <w:rPr>
-          <w:rFonts w:ascii="Trebuchet MS" w:hAnsi="Trebuchet MS"/>
-          <w:lang w:val="es-ES"/>
-        </w:rPr>
-        <w:t>consulting</w:t>
-      </w:r>
-      <w:proofErr w:type="spellEnd"/>
-      <w:r>
-        <w:rPr>
-          <w:rFonts w:ascii="Trebuchet MS" w:hAnsi="Trebuchet MS"/>
-          <w:lang w:val="es-ES"/>
-        </w:rPr>
-        <w:t xml:space="preserve"> </w:t>
-      </w:r>
-      <w:proofErr w:type="spellStart"/>
-      <w:r>
-        <w:rPr>
-          <w:rFonts w:ascii="Trebuchet MS" w:hAnsi="Trebuchet MS"/>
-          <w:lang w:val="es-ES"/>
-        </w:rPr>
-        <w:t>company</w:t>
-      </w:r>
-      <w:proofErr w:type="spellEnd"/>
-      <w:r>
-        <w:rPr>
-          <w:rFonts w:ascii="Trebuchet MS" w:hAnsi="Trebuchet MS"/>
-          <w:lang w:val="es-ES"/>
-        </w:rPr>
-        <w:t xml:space="preserve"> </w:t>
-      </w:r>
-      <w:proofErr w:type="spellStart"/>
-      <w:r>
-        <w:rPr>
-          <w:rFonts w:ascii="Trebuchet MS" w:hAnsi="Trebuchet MS"/>
-          <w:lang w:val="es-ES"/>
-        </w:rPr>
-        <w:t>that</w:t>
-      </w:r>
-      <w:proofErr w:type="spellEnd"/>
-      <w:r>
-        <w:rPr>
-          <w:rFonts w:ascii="Trebuchet MS" w:hAnsi="Trebuchet MS"/>
-          <w:lang w:val="es-ES"/>
-        </w:rPr>
-        <w:t xml:space="preserve"> </w:t>
-      </w:r>
-      <w:proofErr w:type="spellStart"/>
-      <w:r>
-        <w:rPr>
-          <w:rFonts w:ascii="Trebuchet MS" w:hAnsi="Trebuchet MS"/>
-          <w:lang w:val="es-ES"/>
-        </w:rPr>
-        <w:t>caters</w:t>
-      </w:r>
-      <w:proofErr w:type="spellEnd"/>
-      <w:r>
-        <w:rPr>
-          <w:rFonts w:ascii="Trebuchet MS" w:hAnsi="Trebuchet MS"/>
-          <w:lang w:val="es-ES"/>
-        </w:rPr>
-        <w:t xml:space="preserve"> </w:t>
-      </w:r>
-      <w:proofErr w:type="spellStart"/>
-      <w:r>
-        <w:rPr>
-          <w:rFonts w:ascii="Trebuchet MS" w:hAnsi="Trebuchet MS"/>
-          <w:lang w:val="es-ES"/>
-        </w:rPr>
-        <w:t>to</w:t>
-      </w:r>
-      <w:proofErr w:type="spellEnd"/>
-      <w:r>
-        <w:rPr>
-          <w:rFonts w:ascii="Trebuchet MS" w:hAnsi="Trebuchet MS"/>
-          <w:lang w:val="es-ES"/>
-        </w:rPr>
-        <w:t xml:space="preserve"> the </w:t>
-      </w:r>
-      <w:proofErr w:type="spellStart"/>
-      <w:r>
-        <w:rPr>
-          <w:rFonts w:ascii="Trebuchet MS" w:hAnsi="Trebuchet MS"/>
-          <w:lang w:val="es-ES"/>
-        </w:rPr>
-        <w:t>key</w:t>
-      </w:r>
-      <w:proofErr w:type="spellEnd"/>
-      <w:r>
-        <w:rPr>
-          <w:rFonts w:ascii="Trebuchet MS" w:hAnsi="Trebuchet MS"/>
-          <w:lang w:val="es-ES"/>
-        </w:rPr>
-        <w:t xml:space="preserve"> </w:t>
-      </w:r>
-      <w:proofErr w:type="spellStart"/>
-      <w:r>
-        <w:rPr>
-          <w:rFonts w:ascii="Trebuchet MS" w:hAnsi="Trebuchet MS"/>
-          <w:lang w:val="es-ES"/>
-        </w:rPr>
-        <w:t>players</w:t>
-      </w:r>
-      <w:proofErr w:type="spellEnd"/>
-      <w:r>
-        <w:rPr>
-          <w:rFonts w:ascii="Trebuchet MS" w:hAnsi="Trebuchet MS"/>
-          <w:lang w:val="es-ES"/>
-        </w:rPr>
-        <w:t xml:space="preserve"> in </w:t>
-      </w:r>
-      <w:proofErr w:type="spellStart"/>
-      <w:r>
-        <w:rPr>
-          <w:rFonts w:ascii="Trebuchet MS" w:hAnsi="Trebuchet MS"/>
-          <w:lang w:val="es-ES"/>
-        </w:rPr>
-        <w:t>my</w:t>
-      </w:r>
-      <w:proofErr w:type="spellEnd"/>
-      <w:r>
-        <w:rPr>
-          <w:rFonts w:ascii="Trebuchet MS" w:hAnsi="Trebuchet MS"/>
-          <w:lang w:val="es-ES"/>
-        </w:rPr>
-        <w:t xml:space="preserve"> industries (</w:t>
-      </w:r>
-      <w:proofErr w:type="spellStart"/>
-      <w:r>
-        <w:rPr>
-          <w:rFonts w:ascii="Trebuchet MS" w:hAnsi="Trebuchet MS"/>
-          <w:lang w:val="es-ES"/>
-        </w:rPr>
-        <w:t>there</w:t>
-      </w:r>
-      <w:proofErr w:type="spellEnd"/>
-      <w:r>
-        <w:rPr>
-          <w:rFonts w:ascii="Trebuchet MS" w:hAnsi="Trebuchet MS"/>
-          <w:lang w:val="es-ES"/>
-        </w:rPr>
-        <w:t xml:space="preserve"> </w:t>
-      </w:r>
-      <w:proofErr w:type="spellStart"/>
-      <w:r>
-        <w:rPr>
-          <w:rFonts w:ascii="Trebuchet MS" w:hAnsi="Trebuchet MS"/>
-          <w:lang w:val="es-ES"/>
-        </w:rPr>
-        <w:t>is</w:t>
-      </w:r>
-      <w:proofErr w:type="spellEnd"/>
-      <w:r>
-        <w:rPr>
-          <w:rFonts w:ascii="Trebuchet MS" w:hAnsi="Trebuchet MS"/>
-          <w:lang w:val="es-ES"/>
-        </w:rPr>
-        <w:t xml:space="preserve"> no </w:t>
-      </w:r>
-      <w:proofErr w:type="spellStart"/>
-      <w:r>
-        <w:rPr>
-          <w:rFonts w:ascii="Trebuchet MS" w:hAnsi="Trebuchet MS"/>
-          <w:lang w:val="es-ES"/>
-        </w:rPr>
-        <w:t>such</w:t>
-      </w:r>
-      <w:proofErr w:type="spellEnd"/>
-      <w:r>
-        <w:rPr>
-          <w:rFonts w:ascii="Trebuchet MS" w:hAnsi="Trebuchet MS"/>
-          <w:lang w:val="es-ES"/>
-        </w:rPr>
-        <w:t xml:space="preserve"> </w:t>
-      </w:r>
-      <w:proofErr w:type="spellStart"/>
-      <w:r>
-        <w:rPr>
-          <w:rFonts w:ascii="Trebuchet MS" w:hAnsi="Trebuchet MS"/>
-          <w:lang w:val="es-ES"/>
-        </w:rPr>
-        <w:t>consultancy</w:t>
-      </w:r>
-      <w:proofErr w:type="spellEnd"/>
-      <w:r>
-        <w:rPr>
-          <w:rFonts w:ascii="Trebuchet MS" w:hAnsi="Trebuchet MS"/>
-          <w:lang w:val="es-ES"/>
-        </w:rPr>
-        <w:t xml:space="preserve"> in Korea at </w:t>
-      </w:r>
-      <w:proofErr w:type="spellStart"/>
-      <w:r>
-        <w:rPr>
-          <w:rFonts w:ascii="Trebuchet MS" w:hAnsi="Trebuchet MS"/>
-          <w:lang w:val="es-ES"/>
-        </w:rPr>
-        <w:t>this</w:t>
-      </w:r>
-      <w:proofErr w:type="spellEnd"/>
-      <w:r>
-        <w:rPr>
-          <w:rFonts w:ascii="Trebuchet MS" w:hAnsi="Trebuchet MS"/>
-          <w:lang w:val="es-ES"/>
-        </w:rPr>
-        <w:t xml:space="preserve"> </w:t>
-      </w:r>
-      <w:proofErr w:type="spellStart"/>
-      <w:r>
-        <w:rPr>
-          <w:rFonts w:ascii="Trebuchet MS" w:hAnsi="Trebuchet MS"/>
-          <w:lang w:val="es-ES"/>
-        </w:rPr>
-        <w:t>point</w:t>
-      </w:r>
-      <w:proofErr w:type="spellEnd"/>
-      <w:r>
-        <w:rPr>
-          <w:rFonts w:ascii="Trebuchet MS" w:hAnsi="Trebuchet MS"/>
-          <w:lang w:val="es-ES"/>
-        </w:rPr>
-        <w:t>).</w:t>
-      </w:r>
-      <w:r>
-        <w:rPr>
-          <w:rFonts w:ascii="Trebuchet MS" w:hAnsi="Trebuchet MS"/>
-          <w:lang w:val="es-ES"/>
-        </w:rPr>
-        <w:t xml:space="preserve"> </w:t>
+        <w:t xml:space="preserve">As such, I plan to join a consulting firm afterward to help existing companies better understand their customers and provide better services. Later, if I may, I hope to start my own consulting company that caters to the key players in my industries (there is no such consultancy in Korea at this point). </w:t>
       </w:r>
     </w:p>
     <w:p>
@@ -2790,100 +2155,7 @@
         </w:rPr>
       </w:pPr>
       <w:r>
-        <w:rPr>
-          <w:rFonts w:ascii="Trebuchet MS" w:hAnsi="Trebuchet MS" w:hint="eastAsia"/>
-        </w:rPr>
-        <w:t xml:space="preserve">Accordingly, </w:t>
-      </w:r>
-      <w:r>
-        <w:rPr>
-          <w:rFonts w:ascii="Trebuchet MS" w:hAnsi="Trebuchet MS"/>
-        </w:rPr>
-        <w:t>business analytics</w:t>
-      </w:r>
-      <w:r>
-        <w:rPr>
-          <w:rFonts w:ascii="Trebuchet MS" w:hAnsi="Trebuchet MS" w:hint="eastAsia"/>
-        </w:rPr>
-        <w:t xml:space="preserve"> is the </w:t>
-      </w:r>
-      <w:r>
-        <w:rPr>
-          <w:rFonts w:ascii="Trebuchet MS" w:hAnsi="Trebuchet MS"/>
-        </w:rPr>
-        <w:t>ideal</w:t>
-      </w:r>
-      <w:r>
-        <w:rPr>
-          <w:rFonts w:ascii="Trebuchet MS" w:hAnsi="Trebuchet MS" w:hint="eastAsia"/>
-        </w:rPr>
-        <w:t xml:space="preserve"> field of study for me</w:t>
-      </w:r>
-      <w:r>
-        <w:rPr>
-          <w:rFonts w:ascii="Trebuchet MS" w:hAnsi="Trebuchet MS"/>
-        </w:rPr>
-        <w:t>, allowing me</w:t>
-      </w:r>
-      <w:r>
-        <w:rPr>
-          <w:rFonts w:ascii="Trebuchet MS" w:hAnsi="Trebuchet MS" w:hint="eastAsia"/>
-        </w:rPr>
-        <w:t xml:space="preserve"> to help provide </w:t>
-      </w:r>
-      <w:r>
-        <w:rPr>
-          <w:rFonts w:ascii="Trebuchet MS" w:hAnsi="Trebuchet MS"/>
-        </w:rPr>
-        <w:t>“</w:t>
-      </w:r>
-      <w:r>
-        <w:rPr>
-          <w:rFonts w:ascii="Trebuchet MS" w:hAnsi="Trebuchet MS" w:hint="eastAsia"/>
-        </w:rPr>
-        <w:t>good things in life</w:t>
-      </w:r>
-      <w:r>
-        <w:rPr>
-          <w:rFonts w:ascii="Trebuchet MS" w:hAnsi="Trebuchet MS"/>
-        </w:rPr>
-        <w:t>”</w:t>
-      </w:r>
-      <w:r>
-        <w:rPr>
-          <w:rFonts w:ascii="Trebuchet MS" w:hAnsi="Trebuchet MS" w:hint="eastAsia"/>
-        </w:rPr>
-        <w:t xml:space="preserve"> </w:t>
-      </w:r>
-      <w:r>
-        <w:rPr>
-          <w:rFonts w:ascii="Trebuchet MS" w:hAnsi="Trebuchet MS"/>
-        </w:rPr>
-        <w:t>that contribute to</w:t>
-      </w:r>
-      <w:r>
-        <w:rPr>
-          <w:rFonts w:ascii="Trebuchet MS" w:hAnsi="Trebuchet MS" w:hint="eastAsia"/>
-        </w:rPr>
-        <w:t xml:space="preserve"> </w:t>
-      </w:r>
-      <w:r>
-        <w:rPr>
-          <w:rFonts w:ascii="Trebuchet MS" w:hAnsi="Trebuchet MS"/>
-        </w:rPr>
-        <w:t xml:space="preserve">a </w:t>
-      </w:r>
-      <w:r>
-        <w:rPr>
-          <w:rFonts w:ascii="Trebuchet MS" w:hAnsi="Trebuchet MS" w:hint="eastAsia"/>
-        </w:rPr>
-        <w:t>good life</w:t>
-      </w:r>
-      <w:r>
-        <w:rPr>
-          <w:rFonts w:ascii="Trebuchet MS" w:hAnsi="Trebuchet MS"/>
-        </w:rPr>
-        <w:t xml:space="preserve">. </w:t>
+        <w:t xml:space="preserve">I want to help provide “good things in life” that contribute to a good life. </w:t>
       </w:r>
     </w:p>
     <w:p>

</xml_diff>